<commit_message>
added sem 4 notes
</commit_message>
<xml_diff>
--- a/Semester 3/Research Project/Final Report - MAIN.docx
+++ b/Semester 3/Research Project/Final Report - MAIN.docx
@@ -1326,7 +1326,25 @@
           <w:sz w:val="24"/>
           <w:szCs w:val="24"/>
         </w:rPr>
-        <w:t xml:space="preserve">Precision medicine, often referred to as personalized or individualized medicine, represents a transformative approach in healthcare that tailors medical treatment to the unique characteristics of each patient. This methodology integrates a comprehensive understanding of an individual's genomic, environmental, and lifestyle factors to inform medical decisions, aiming to enhance the prevention, diagnosis, and treatment of diseases. The overarching goal is to move away from the traditional </w:t>
+        <w:t xml:space="preserve">Precision medicine, often referred to as personalized or individualized medicine, represents a transformative approach in healthcare that </w:t>
+      </w:r>
+      <w:proofErr w:type="gramStart"/>
+      <w:r>
+        <w:rPr>
+          <w:rFonts w:ascii="Times New Roman" w:hAnsi="Times New Roman" w:cs="Times New Roman"/>
+          <w:sz w:val="24"/>
+          <w:szCs w:val="24"/>
+        </w:rPr>
+        <w:t>tailors</w:t>
+      </w:r>
+      <w:proofErr w:type="gramEnd"/>
+      <w:r>
+        <w:rPr>
+          <w:rFonts w:ascii="Times New Roman" w:hAnsi="Times New Roman" w:cs="Times New Roman"/>
+          <w:sz w:val="24"/>
+          <w:szCs w:val="24"/>
+        </w:rPr>
+        <w:t xml:space="preserve"> medical treatment to the unique characteristics of each patient. This methodology integrates a comprehensive understanding of an individual's genomic, environmental, and lifestyle factors to inform medical decisions, aiming to enhance the prevention, diagnosis, and treatment of diseases. The overarching goal is to move away from the traditional </w:t>
       </w:r>
       <w:r>
         <w:rPr>
@@ -2449,7 +2467,7 @@
         </w:rPr>
         <w:lastRenderedPageBreak/>
         <w:drawing>
-          <wp:anchor distT="0" distB="0" distL="114300" distR="114300" simplePos="0" relativeHeight="251660288" behindDoc="0" locked="0" layoutInCell="1" allowOverlap="1" wp14:anchorId="5A50F890" wp14:editId="2008BC56">
+          <wp:anchor distT="0" distB="0" distL="114300" distR="114300" simplePos="0" relativeHeight="251660288" behindDoc="0" locked="0" layoutInCell="1" allowOverlap="1" wp14:anchorId="5A50F890" wp14:editId="0DC03CD6">
             <wp:simplePos x="0" y="0"/>
             <wp:positionH relativeFrom="column">
               <wp:posOffset>3206994</wp:posOffset>
@@ -4172,7 +4190,25 @@
           <w:sz w:val="24"/>
           <w:szCs w:val="24"/>
         </w:rPr>
-        <w:t>However, challenges remain, as not all patients with actionable mutations can receive matched therapies due to various barriers, such as access to clinical trials or drug availability. Additionally, despite the success in identifying actionable mutations, only a fraction of patients go on to receive targeted therapies​. Nonetheless, the overall trend suggests that NGS-based oncology treatments improve patient outcomes by offering a more personalized, precise approach to cancer care.</w:t>
+        <w:t xml:space="preserve">However, challenges remain, as not all patients with actionable mutations can receive matched therapies due to various barriers, such as access to clinical trials or drug availability. Additionally, despite the success in identifying actionable mutations, only a fraction of patients </w:t>
+      </w:r>
+      <w:proofErr w:type="gramStart"/>
+      <w:r>
+        <w:rPr>
+          <w:rFonts w:ascii="Times New Roman" w:hAnsi="Times New Roman" w:cs="Times New Roman"/>
+          <w:sz w:val="24"/>
+          <w:szCs w:val="24"/>
+        </w:rPr>
+        <w:t>go</w:t>
+      </w:r>
+      <w:proofErr w:type="gramEnd"/>
+      <w:r>
+        <w:rPr>
+          <w:rFonts w:ascii="Times New Roman" w:hAnsi="Times New Roman" w:cs="Times New Roman"/>
+          <w:sz w:val="24"/>
+          <w:szCs w:val="24"/>
+        </w:rPr>
+        <w:t xml:space="preserve"> on to receive targeted therapies​. Nonetheless, the overall trend suggests that NGS-based oncology treatments improve patient outcomes by offering a more personalized, precise approach to cancer care.</w:t>
       </w:r>
     </w:p>
     <w:p>
@@ -9813,6 +9849,14 @@
         </w:rPr>
         <w:t>Identifying mutations through variant calling processes.</w:t>
       </w:r>
+      <w:r>
+        <w:rPr>
+          <w:rFonts w:ascii="Times New Roman" w:hAnsi="Times New Roman" w:cs="Times New Roman"/>
+          <w:sz w:val="24"/>
+          <w:szCs w:val="24"/>
+        </w:rPr>
+        <w:br/>
+      </w:r>
     </w:p>
     <w:p>
       <w:pPr>
@@ -9837,6 +9881,7 @@
           <w:sz w:val="24"/>
           <w:szCs w:val="24"/>
         </w:rPr>
+        <w:lastRenderedPageBreak/>
         <w:t xml:space="preserve">Data Integration: </w:t>
       </w:r>
       <w:r>
@@ -9871,7 +9916,6 @@
           <w:sz w:val="24"/>
           <w:szCs w:val="24"/>
         </w:rPr>
-        <w:lastRenderedPageBreak/>
         <w:t>Reporting:</w:t>
       </w:r>
       <w:r>
@@ -9941,18 +9985,6 @@
         </w:rPr>
         <w:t>Each step of the pipeline undergoes rigorous testing using sample datasets to validate functionality, ensure data integrity, and optimize performance. Automated scripts and shell scripting are employed to facilitate task automation, manage file operations, and execute command-line tools efficiently.</w:t>
       </w:r>
-    </w:p>
-    <w:p>
-      <w:pPr>
-        <w:spacing w:after="0" w:line="276" w:lineRule="auto"/>
-        <w:ind w:left="360"/>
-        <w:jc w:val="both"/>
-        <w:rPr>
-          <w:rFonts w:ascii="Times New Roman" w:hAnsi="Times New Roman" w:cs="Times New Roman"/>
-          <w:sz w:val="24"/>
-          <w:szCs w:val="24"/>
-        </w:rPr>
-      </w:pPr>
     </w:p>
     <w:p>
       <w:pPr>
@@ -10875,17 +10907,6 @@
         </w:rPr>
         <w:t>Compiles the entire workflow's results into a comprehensive PDF summary, which includes data analysis outcomes and interpretations. This report is made available for download, facilitating easy sharing and review.</w:t>
       </w:r>
-    </w:p>
-    <w:p>
-      <w:pPr>
-        <w:spacing w:after="0" w:line="276" w:lineRule="auto"/>
-        <w:jc w:val="both"/>
-        <w:rPr>
-          <w:rFonts w:ascii="Times New Roman" w:hAnsi="Times New Roman" w:cs="Times New Roman"/>
-          <w:sz w:val="24"/>
-          <w:szCs w:val="24"/>
-        </w:rPr>
-      </w:pPr>
     </w:p>
     <w:p>
       <w:pPr>
@@ -15999,7 +16020,25 @@
           <w:sz w:val="24"/>
           <w:szCs w:val="24"/>
         </w:rPr>
-        <w:t xml:space="preserve">, E. L., Hoffman, M. A., Jiang, X., Madhavan, S., Mattison, J. E., Nagarajan, R., Ray, B., Shin, D., Visweswaran, S., Zhao, Z., &amp; Freimuth, R. R. (2016). An informatics research agenda to support precision medicine: seven key areas. Journal of the American Medical Informatics Association : JAMIA, 23(4), 791–795. </w:t>
+        <w:t xml:space="preserve">, E. L., Hoffman, M. A., Jiang, X., Madhavan, S., Mattison, J. E., Nagarajan, R., Ray, B., Shin, D., Visweswaran, S., Zhao, Z., &amp; Freimuth, R. R. (2016). An informatics research agenda to support precision medicine: seven key areas. Journal of the American Medical Informatics </w:t>
+      </w:r>
+      <w:proofErr w:type="gramStart"/>
+      <w:r>
+        <w:rPr>
+          <w:rFonts w:ascii="Times New Roman" w:hAnsi="Times New Roman" w:cs="Times New Roman"/>
+          <w:sz w:val="24"/>
+          <w:szCs w:val="24"/>
+        </w:rPr>
+        <w:t>Association :</w:t>
+      </w:r>
+      <w:proofErr w:type="gramEnd"/>
+      <w:r>
+        <w:rPr>
+          <w:rFonts w:ascii="Times New Roman" w:hAnsi="Times New Roman" w:cs="Times New Roman"/>
+          <w:sz w:val="24"/>
+          <w:szCs w:val="24"/>
+        </w:rPr>
+        <w:t xml:space="preserve"> JAMIA, 23(4), 791–795. </w:t>
       </w:r>
       <w:hyperlink r:id="rId41" w:history="1">
         <w:r>
@@ -16200,7 +16239,7 @@
 <w:numbering xmlns:wpc="http://schemas.microsoft.com/office/word/2010/wordprocessingCanvas" xmlns:cx="http://schemas.microsoft.com/office/drawing/2014/chartex" xmlns:cx1="http://schemas.microsoft.com/office/drawing/2015/9/8/chartex" xmlns:cx2="http://schemas.microsoft.com/office/drawing/2015/10/21/chartex" xmlns:cx3="http://schemas.microsoft.com/office/drawing/2016/5/9/chartex" xmlns:cx4="http://schemas.microsoft.com/office/drawing/2016/5/10/chartex" xmlns:cx5="http://schemas.microsoft.com/office/drawing/2016/5/11/chartex" xmlns:cx6="http://schemas.microsoft.com/office/drawing/2016/5/12/chartex" xmlns:cx7="http://schemas.microsoft.com/office/drawing/2016/5/13/chartex" xmlns:cx8="http://schemas.microsoft.com/office/drawing/2016/5/14/chartex" xmlns:mc="http://schemas.openxmlformats.org/markup-compatibility/2006" xmlns:aink="http://schemas.microsoft.com/office/drawing/2016/ink" xmlns:am3d="http://schemas.microsoft.com/office/drawing/2017/model3d" xmlns:o="urn:schemas-microsoft-com:office:office" xmlns:oel="http://schemas.microsoft.com/office/2019/extlst" xmlns:r="http://schemas.openxmlformats.org/officeDocument/2006/relationships" xmlns:m="http://schemas.openxmlformats.org/officeDocument/2006/math" xmlns:v="urn:schemas-microsoft-com:vml" xmlns:wp14="http://schemas.microsoft.com/office/word/2010/wordprocessingDrawing" xmlns:wp="http://schemas.openxmlformats.org/drawingml/2006/wordprocessingDrawing" xmlns:w10="urn:schemas-microsoft-com:office:word" xmlns:w="http://schemas.openxmlformats.org/wordprocessingml/2006/main" xmlns:w14="http://schemas.microsoft.com/office/word/2010/wordml" xmlns:w15="http://schemas.microsoft.com/office/word/2012/wordml" xmlns:w16cex="http://schemas.microsoft.com/office/word/2018/wordml/cex" xmlns:w16cid="http://schemas.microsoft.com/office/word/2016/wordml/cid" xmlns:w16="http://schemas.microsoft.com/office/word/2018/wordml" xmlns:w16du="http://schemas.microsoft.com/office/word/2023/wordml/word16du" xmlns:w16sdtdh="http://schemas.microsoft.com/office/word/2020/wordml/sdtdatahash" xmlns:w16se="http://schemas.microsoft.com/office/word/2015/wordml/symex" xmlns:wpg="http://schemas.microsoft.com/office/word/2010/wordprocessingGroup" xmlns:wpi="http://schemas.microsoft.com/office/word/2010/wordprocessingInk" xmlns:wne="http://schemas.microsoft.com/office/word/2006/wordml" xmlns:wps="http://schemas.microsoft.com/office/word/2010/wordprocessingShape" mc:Ignorable="w14 w15 w16se w16cid w16 w16cex w16sdtdh w16du wp14">
   <w:numPicBullet w:numPicBulletId="0">
     <w:pict>
-      <v:rect id="_x0000_i1041" style="width:0;height:1.5pt" o:hralign="center" o:bullet="t" o:hrstd="t" o:hr="t" fillcolor="#a0a0a0" stroked="f"/>
+      <v:rect id="_x0000_i1040" style="width:0;height:1.5pt" o:hralign="center" o:bullet="t" o:hrstd="t" o:hr="t" fillcolor="#a0a0a0" stroked="f"/>
     </w:pict>
   </w:numPicBullet>
   <w:abstractNum w:abstractNumId="0" w15:restartNumberingAfterBreak="0">

</xml_diff>